<commit_message>
Fix credit for DAL loans
</commit_message>
<xml_diff>
--- a/presentation/Team Essay.docx
+++ b/presentation/Team Essay.docx
@@ -3303,12 +3303,6 @@
         <w:gridCol w:w="4026"/>
       </w:tblGrid>
       <w:tr>
-        <w:tblPrEx>
-          <w:tblCellMar>
-            <w:top w:w="0" w:type="dxa"/>
-            <w:bottom w:w="0" w:type="dxa"/>
-          </w:tblCellMar>
-        </w:tblPrEx>
         <w:tc>
           <w:tcPr>
             <w:tcW w:w="2600" w:type="dxa"/>
@@ -3456,12 +3450,6 @@
         </w:tc>
       </w:tr>
       <w:tr>
-        <w:tblPrEx>
-          <w:tblCellMar>
-            <w:top w:w="0" w:type="dxa"/>
-            <w:bottom w:w="0" w:type="dxa"/>
-          </w:tblCellMar>
-        </w:tblPrEx>
         <w:tc>
           <w:tcPr>
             <w:tcW w:w="2600" w:type="dxa"/>
@@ -3630,28 +3618,43 @@
                 <w:sz w:val="21"/>
                 <w:szCs w:val="21"/>
               </w:rPr>
-              <w:t xml:space="preserve">statistics, ratings, </w:t>
-            </w:r>
-            <w:r>
-              <w:rPr>
-                <w:sz w:val="21"/>
-                <w:szCs w:val="21"/>
-              </w:rPr>
-              <w:t>validation</w:t>
-            </w:r>
-            <w:r>
-              <w:rPr>
-                <w:sz w:val="21"/>
-                <w:szCs w:val="21"/>
-              </w:rPr>
-              <w:t xml:space="preserve"> &amp; </w:t>
-            </w:r>
-            <w:r>
-              <w:rPr>
-                <w:sz w:val="21"/>
-                <w:szCs w:val="21"/>
-              </w:rPr>
-              <w:t>α</w:t>
+              <w:t>statistics, ratings</w:t>
+            </w:r>
+            <w:r>
+              <w:rPr>
+                <w:sz w:val="21"/>
+                <w:szCs w:val="21"/>
+              </w:rPr>
+              <w:t xml:space="preserve"> </w:t>
+            </w:r>
+            <w:r>
+              <w:rPr>
+                <w:sz w:val="21"/>
+                <w:szCs w:val="21"/>
+                <w:lang w:val="el-GR"/>
+              </w:rPr>
+              <w:t>και</w:t>
+            </w:r>
+            <w:r>
+              <w:rPr>
+                <w:sz w:val="21"/>
+                <w:szCs w:val="21"/>
+              </w:rPr>
+              <w:t xml:space="preserve"> </w:t>
+            </w:r>
+            <w:r>
+              <w:rPr>
+                <w:sz w:val="21"/>
+                <w:szCs w:val="21"/>
+              </w:rPr>
+              <w:t xml:space="preserve">loans, </w:t>
+            </w:r>
+            <w:r>
+              <w:rPr>
+                <w:sz w:val="21"/>
+                <w:szCs w:val="21"/>
+              </w:rPr>
+              <w:t>validation &amp; α</w:t>
             </w:r>
             <w:proofErr w:type="spellStart"/>
             <w:r>
@@ -3682,12 +3685,6 @@
         </w:tc>
       </w:tr>
       <w:tr>
-        <w:tblPrEx>
-          <w:tblCellMar>
-            <w:top w:w="0" w:type="dxa"/>
-            <w:bottom w:w="0" w:type="dxa"/>
-          </w:tblCellMar>
-        </w:tblPrEx>
         <w:tc>
           <w:tcPr>
             <w:tcW w:w="2600" w:type="dxa"/>
@@ -3791,20 +3788,13 @@
             <w:vAlign w:val="center"/>
           </w:tcPr>
           <w:p>
-            <w:r>
-              <w:rPr>
-                <w:sz w:val="21"/>
-                <w:szCs w:val="21"/>
-              </w:rPr>
-              <w:t xml:space="preserve">DAL </w:t>
-            </w:r>
             <w:proofErr w:type="spellStart"/>
             <w:r>
               <w:rPr>
                 <w:sz w:val="21"/>
                 <w:szCs w:val="21"/>
               </w:rPr>
-              <w:t>γι</w:t>
+              <w:t>BusinessLogic</w:t>
             </w:r>
             <w:proofErr w:type="spellEnd"/>
             <w:r>
@@ -3812,30 +3802,7 @@
                 <w:sz w:val="21"/>
                 <w:szCs w:val="21"/>
               </w:rPr>
-              <w:t xml:space="preserve">α loans, </w:t>
-            </w:r>
-            <w:proofErr w:type="spellStart"/>
-            <w:r>
-              <w:rPr>
-                <w:sz w:val="21"/>
-                <w:szCs w:val="21"/>
-              </w:rPr>
-              <w:t>BusinessLogic</w:t>
-            </w:r>
-            <w:proofErr w:type="spellEnd"/>
-            <w:r>
-              <w:rPr>
-                <w:sz w:val="21"/>
-                <w:szCs w:val="21"/>
-              </w:rPr>
-              <w:t xml:space="preserve"> </w:t>
-            </w:r>
-            <w:r>
-              <w:rPr>
-                <w:sz w:val="21"/>
-                <w:szCs w:val="21"/>
-              </w:rPr>
-              <w:t>members/categories/books.</w:t>
+              <w:t xml:space="preserve"> members/categories/books.</w:t>
             </w:r>
             <w:r>
               <w:rPr>
@@ -3869,12 +3836,6 @@
         </w:tc>
       </w:tr>
       <w:tr>
-        <w:tblPrEx>
-          <w:tblCellMar>
-            <w:top w:w="0" w:type="dxa"/>
-            <w:bottom w:w="0" w:type="dxa"/>
-          </w:tblCellMar>
-        </w:tblPrEx>
         <w:tc>
           <w:tcPr>
             <w:tcW w:w="2600" w:type="dxa"/>
@@ -4065,21 +4026,7 @@
                 <w:sz w:val="21"/>
                 <w:szCs w:val="21"/>
               </w:rPr>
-              <w:t xml:space="preserve"> </w:t>
-            </w:r>
-            <w:r>
-              <w:rPr>
-                <w:sz w:val="21"/>
-                <w:szCs w:val="21"/>
-              </w:rPr>
-              <w:t>Members</w:t>
-            </w:r>
-            <w:r>
-              <w:rPr>
-                <w:sz w:val="21"/>
-                <w:szCs w:val="21"/>
-              </w:rPr>
-              <w:t>,</w:t>
+              <w:t xml:space="preserve"> Members,</w:t>
             </w:r>
             <w:r>
               <w:rPr>
@@ -4162,12 +4109,6 @@
         </w:tc>
       </w:tr>
       <w:tr>
-        <w:tblPrEx>
-          <w:tblCellMar>
-            <w:top w:w="0" w:type="dxa"/>
-            <w:bottom w:w="0" w:type="dxa"/>
-          </w:tblCellMar>
-        </w:tblPrEx>
         <w:tc>
           <w:tcPr>
             <w:tcW w:w="2600" w:type="dxa"/>
@@ -4524,12 +4465,6 @@
         <w:gridCol w:w="4513"/>
       </w:tblGrid>
       <w:tr>
-        <w:tblPrEx>
-          <w:tblCellMar>
-            <w:top w:w="0" w:type="dxa"/>
-            <w:bottom w:w="0" w:type="dxa"/>
-          </w:tblCellMar>
-        </w:tblPrEx>
         <w:tc>
           <w:tcPr>
             <w:tcW w:w="4513" w:type="dxa"/>
@@ -4663,12 +4598,6 @@
         </w:tc>
       </w:tr>
       <w:tr>
-        <w:tblPrEx>
-          <w:tblCellMar>
-            <w:top w:w="0" w:type="dxa"/>
-            <w:bottom w:w="0" w:type="dxa"/>
-          </w:tblCellMar>
-        </w:tblPrEx>
         <w:tc>
           <w:tcPr>
             <w:tcW w:w="4513" w:type="dxa"/>
@@ -4791,12 +4720,6 @@
         </w:tc>
       </w:tr>
       <w:tr>
-        <w:tblPrEx>
-          <w:tblCellMar>
-            <w:top w:w="0" w:type="dxa"/>
-            <w:bottom w:w="0" w:type="dxa"/>
-          </w:tblCellMar>
-        </w:tblPrEx>
         <w:tc>
           <w:tcPr>
             <w:tcW w:w="4513" w:type="dxa"/>
@@ -4905,12 +4828,6 @@
         </w:tc>
       </w:tr>
       <w:tr>
-        <w:tblPrEx>
-          <w:tblCellMar>
-            <w:top w:w="0" w:type="dxa"/>
-            <w:bottom w:w="0" w:type="dxa"/>
-          </w:tblCellMar>
-        </w:tblPrEx>
         <w:tc>
           <w:tcPr>
             <w:tcW w:w="4513" w:type="dxa"/>
@@ -4991,12 +4908,6 @@
         </w:tc>
       </w:tr>
       <w:tr>
-        <w:tblPrEx>
-          <w:tblCellMar>
-            <w:top w:w="0" w:type="dxa"/>
-            <w:bottom w:w="0" w:type="dxa"/>
-          </w:tblCellMar>
-        </w:tblPrEx>
         <w:tc>
           <w:tcPr>
             <w:tcW w:w="4513" w:type="dxa"/>
@@ -5099,12 +5010,6 @@
         </w:tc>
       </w:tr>
       <w:tr>
-        <w:tblPrEx>
-          <w:tblCellMar>
-            <w:top w:w="0" w:type="dxa"/>
-            <w:bottom w:w="0" w:type="dxa"/>
-          </w:tblCellMar>
-        </w:tblPrEx>
         <w:tc>
           <w:tcPr>
             <w:tcW w:w="4513" w:type="dxa"/>
@@ -5211,12 +5116,6 @@
         </w:tc>
       </w:tr>
       <w:tr>
-        <w:tblPrEx>
-          <w:tblCellMar>
-            <w:top w:w="0" w:type="dxa"/>
-            <w:bottom w:w="0" w:type="dxa"/>
-          </w:tblCellMar>
-        </w:tblPrEx>
         <w:tc>
           <w:tcPr>
             <w:tcW w:w="4513" w:type="dxa"/>
@@ -5880,9 +5779,6 @@
         <w:t>. https://docs.python.org/3/library/dataclasses.html</w:t>
       </w:r>
       <w:r>
-        <w:rPr>
-          <w:lang w:val="el-GR"/>
-        </w:rPr>
         <w:br w:type="page"/>
       </w:r>
     </w:p>

</xml_diff>